<commit_message>
Fixed problems with sample papers
</commit_message>
<xml_diff>
--- a/After/oops/OOP_Paper_1_Section_A.docx
+++ b/After/oops/OOP_Paper_1_Section_A.docx
@@ -869,35 +869,7 @@
         <w:rPr>
           <w:rFonts w:ascii="Calibri" w:eastAsia="Calibri" w:hAnsi="Calibri" w:cs="Calibri"/>
         </w:rPr>
-        <w:t xml:space="preserve">A developer creates a class Animal with a method </w:t>
-      </w:r>
-      <w:proofErr w:type="spellStart"/>
-      <w:r>
-        <w:rPr>
-          <w:rFonts w:ascii="Calibri" w:eastAsia="Calibri" w:hAnsi="Calibri" w:cs="Calibri"/>
-        </w:rPr>
-        <w:t>makeSound</w:t>
-      </w:r>
-      <w:proofErr w:type="spellEnd"/>
-      <w:r>
-        <w:rPr>
-          <w:rFonts w:ascii="Calibri" w:eastAsia="Calibri" w:hAnsi="Calibri" w:cs="Calibri"/>
-        </w:rPr>
-        <w:t xml:space="preserve">(). He creates subclasses Dog and Cat. Why should </w:t>
-      </w:r>
-      <w:proofErr w:type="spellStart"/>
-      <w:r>
-        <w:rPr>
-          <w:rFonts w:ascii="Calibri" w:eastAsia="Calibri" w:hAnsi="Calibri" w:cs="Calibri"/>
-        </w:rPr>
-        <w:t>makeSound</w:t>
-      </w:r>
-      <w:proofErr w:type="spellEnd"/>
-      <w:r>
-        <w:rPr>
-          <w:rFonts w:ascii="Calibri" w:eastAsia="Calibri" w:hAnsi="Calibri" w:cs="Calibri"/>
-        </w:rPr>
-        <w:t>() be declared abstract in Animal? What happens if it is not declared abstract? [3 Marks]</w:t>
+        <w:t>A developer creates a class Animal with a method makeSound(). He creates subclasses Dog and Cat. Why should makeSound() be declared abstract in Animal? What happens if it is not declared abstract? [3 Marks]</w:t>
       </w:r>
     </w:p>
     <w:p>
@@ -1516,7 +1488,6 @@
               </w:rPr>
               <w:t xml:space="preserve"> </w:t>
             </w:r>
-            <w:proofErr w:type="spellStart"/>
             <w:r>
               <w:rPr>
                 <w:rFonts w:ascii="Consolas" w:hAnsi="Consolas"/>
@@ -1526,7 +1497,6 @@
               </w:rPr>
               <w:t>getArea</w:t>
             </w:r>
-            <w:proofErr w:type="spellEnd"/>
             <w:r>
               <w:rPr>
                 <w:rFonts w:ascii="Consolas" w:hAnsi="Consolas"/>
@@ -1592,16 +1562,7 @@
                 <w:sz w:val="21"/>
                 <w:szCs w:val="21"/>
               </w:rPr>
-              <w:t xml:space="preserve"> height    </w:t>
-            </w:r>
-            <w:r>
-              <w:rPr>
-                <w:rFonts w:ascii="Consolas" w:hAnsi="Consolas"/>
-                <w:color w:val="008000"/>
-                <w:sz w:val="21"/>
-                <w:szCs w:val="21"/>
-              </w:rPr>
-              <w:t>// missing semicolon</w:t>
+              <w:t xml:space="preserve"> height</w:t>
             </w:r>
           </w:p>
           <w:p>
@@ -1825,7 +1786,6 @@
               </w:rPr>
               <w:t xml:space="preserve"> </w:t>
             </w:r>
-            <w:proofErr w:type="spellStart"/>
             <w:r>
               <w:rPr>
                 <w:rFonts w:ascii="Consolas" w:hAnsi="Consolas"/>
@@ -1835,7 +1795,6 @@
               </w:rPr>
               <w:t>args</w:t>
             </w:r>
-            <w:proofErr w:type="spellEnd"/>
             <w:r>
               <w:rPr>
                 <w:rFonts w:ascii="Consolas" w:hAnsi="Consolas"/>
@@ -2013,7 +1972,6 @@
               </w:rPr>
               <w:t xml:space="preserve">        </w:t>
             </w:r>
-            <w:proofErr w:type="spellStart"/>
             <w:r>
               <w:rPr>
                 <w:rFonts w:ascii="Consolas" w:hAnsi="Consolas"/>
@@ -2059,7 +2017,6 @@
               </w:rPr>
               <w:t>println</w:t>
             </w:r>
-            <w:proofErr w:type="spellEnd"/>
             <w:r>
               <w:rPr>
                 <w:rFonts w:ascii="Consolas" w:hAnsi="Consolas"/>
@@ -2105,7 +2062,6 @@
               </w:rPr>
               <w:t xml:space="preserve"> </w:t>
             </w:r>
-            <w:proofErr w:type="spellStart"/>
             <w:r>
               <w:rPr>
                 <w:rFonts w:ascii="Consolas" w:hAnsi="Consolas"/>
@@ -2133,24 +2089,14 @@
               </w:rPr>
               <w:t>area</w:t>
             </w:r>
-            <w:proofErr w:type="spellEnd"/>
-            <w:r>
-              <w:rPr>
-                <w:rFonts w:ascii="Consolas" w:hAnsi="Consolas"/>
-                <w:color w:val="3B3B3B"/>
-                <w:sz w:val="21"/>
-                <w:szCs w:val="21"/>
-              </w:rPr>
-              <w:t>());  </w:t>
-            </w:r>
-            <w:r>
-              <w:rPr>
-                <w:rFonts w:ascii="Consolas" w:hAnsi="Consolas"/>
-                <w:color w:val="008000"/>
-                <w:sz w:val="21"/>
-                <w:szCs w:val="21"/>
-              </w:rPr>
-              <w:t>// wrong method name</w:t>
+            <w:r>
+              <w:rPr>
+                <w:rFonts w:ascii="Consolas" w:hAnsi="Consolas"/>
+                <w:color w:val="3B3B3B"/>
+                <w:sz w:val="21"/>
+                <w:szCs w:val="21"/>
+              </w:rPr>
+              <w:t>());</w:t>
             </w:r>
           </w:p>
           <w:p>
@@ -2529,7 +2475,6 @@
               </w:rPr>
               <w:t xml:space="preserve">() { </w:t>
             </w:r>
-            <w:proofErr w:type="spellStart"/>
             <w:r>
               <w:rPr>
                 <w:rFonts w:ascii="Consolas" w:hAnsi="Consolas"/>
@@ -2575,7 +2520,6 @@
               </w:rPr>
               <w:t>println</w:t>
             </w:r>
-            <w:proofErr w:type="spellEnd"/>
             <w:r>
               <w:rPr>
                 <w:rFonts w:ascii="Consolas" w:hAnsi="Consolas"/>
@@ -2822,7 +2766,6 @@
               </w:rPr>
               <w:t xml:space="preserve">[] </w:t>
             </w:r>
-            <w:proofErr w:type="spellStart"/>
             <w:r>
               <w:rPr>
                 <w:rFonts w:ascii="Consolas" w:hAnsi="Consolas"/>
@@ -2832,7 +2775,6 @@
               </w:rPr>
               <w:t>args</w:t>
             </w:r>
-            <w:proofErr w:type="spellEnd"/>
             <w:r>
               <w:rPr>
                 <w:rFonts w:ascii="Consolas" w:hAnsi="Consolas"/>
@@ -3406,21 +3348,7 @@
         <w:rPr>
           <w:rFonts w:ascii="Calibri" w:eastAsia="Calibri" w:hAnsi="Calibri" w:cs="Calibri"/>
         </w:rPr>
-        <w:t xml:space="preserve">Inheritance: Create a base class </w:t>
-      </w:r>
-      <w:proofErr w:type="spellStart"/>
-      <w:r>
-        <w:rPr>
-          <w:rFonts w:ascii="Calibri" w:eastAsia="Calibri" w:hAnsi="Calibri" w:cs="Calibri"/>
-        </w:rPr>
-        <w:t>LibraryItem</w:t>
-      </w:r>
-      <w:proofErr w:type="spellEnd"/>
-      <w:r>
-        <w:rPr>
-          <w:rFonts w:ascii="Calibri" w:eastAsia="Calibri" w:hAnsi="Calibri" w:cs="Calibri"/>
-        </w:rPr>
-        <w:t xml:space="preserve"> and derive Book and Magazine from it.</w:t>
+        <w:t>Inheritance: Create a base class LibraryItem and derive Book and Magazine from it.</w:t>
       </w:r>
     </w:p>
     <w:p>
@@ -3460,21 +3388,7 @@
         <w:rPr>
           <w:rFonts w:ascii="Calibri" w:eastAsia="Calibri" w:hAnsi="Calibri" w:cs="Calibri"/>
         </w:rPr>
-        <w:t xml:space="preserve">Polymorphism: Override a </w:t>
-      </w:r>
-      <w:proofErr w:type="spellStart"/>
-      <w:r>
-        <w:rPr>
-          <w:rFonts w:ascii="Calibri" w:eastAsia="Calibri" w:hAnsi="Calibri" w:cs="Calibri"/>
-        </w:rPr>
-        <w:t>displayInfo</w:t>
-      </w:r>
-      <w:proofErr w:type="spellEnd"/>
-      <w:r>
-        <w:rPr>
-          <w:rFonts w:ascii="Calibri" w:eastAsia="Calibri" w:hAnsi="Calibri" w:cs="Calibri"/>
-        </w:rPr>
-        <w:t>() method in each subclass.</w:t>
+        <w:t>Polymorphism: Override a displayInfo() method in each subclass.</w:t>
       </w:r>
     </w:p>
     <w:p>
@@ -3494,21 +3408,7 @@
         <w:rPr>
           <w:rFonts w:ascii="Calibri" w:eastAsia="Calibri" w:hAnsi="Calibri" w:cs="Calibri"/>
         </w:rPr>
-        <w:t xml:space="preserve">Abstraction: Use an abstract class or interface for common item </w:t>
-      </w:r>
-      <w:proofErr w:type="spellStart"/>
-      <w:r>
-        <w:rPr>
-          <w:rFonts w:ascii="Calibri" w:eastAsia="Calibri" w:hAnsi="Calibri" w:cs="Calibri"/>
-        </w:rPr>
-        <w:t>behaviour</w:t>
-      </w:r>
-      <w:proofErr w:type="spellEnd"/>
-      <w:r>
-        <w:rPr>
-          <w:rFonts w:ascii="Calibri" w:eastAsia="Calibri" w:hAnsi="Calibri" w:cs="Calibri"/>
-        </w:rPr>
-        <w:t>.</w:t>
+        <w:t>Abstraction: Use an abstract class or interface for common item behaviour.</w:t>
       </w:r>
     </w:p>
     <w:p>

</xml_diff>